<commit_message>
fix: BD template - remove Vynta and Nordsky footer logos
Removed the Vynta and Nordsky logo pictures from both footers
(footer1 = all pages, footer2 = first page) of the Beyond Data
output template. Dropped the now-unused image relationships and
media files (image9.png, image11.png), and re-centered the
remaining Agilos logo, which was anchored left-of-center as part
of the three-logo group.

Applied to both docs/word_templates (GitHub Pages build) and
word_templates (server build).

Co-Authored-By: Claude Opus 5 (1M context) <noreply@anthropic.com>
</commit_message>
<xml_diff>
--- a/docs/word_templates/beyond_data.docx
+++ b/docs/word_templates/beyond_data.docx
@@ -12145,67 +12145,6 @@
     </w:pPr>
     <w:r>
       <w:rPr>
-        <w:noProof/>
-        <w:color w:val="2D2F67"/>
-      </w:rPr>
-      <w:drawing>
-        <wp:anchor distT="0" distB="0" distL="114300" distR="114300" simplePos="0" relativeHeight="251658242" behindDoc="0" locked="0" layoutInCell="1" allowOverlap="1" wp14:anchorId="6FF33337" wp14:editId="4FB8DD76">
-          <wp:simplePos x="0" y="0"/>
-          <wp:positionH relativeFrom="page">
-            <wp:posOffset>3380105</wp:posOffset>
-          </wp:positionH>
-          <wp:positionV relativeFrom="paragraph">
-            <wp:posOffset>410845</wp:posOffset>
-          </wp:positionV>
-          <wp:extent cx="913130" cy="314325"/>
-          <wp:effectExtent l="0" t="0" r="1270" b="9525"/>
-          <wp:wrapSquare wrapText="bothSides"/>
-          <wp:docPr id="692005353" name="Picture 11" descr="A black and orange logo&#10;&#10;Description automatically generated"/>
-          <wp:cNvGraphicFramePr>
-            <a:graphicFrameLocks xmlns:a="http://schemas.openxmlformats.org/drawingml/2006/main" noChangeAspect="1"/>
-          </wp:cNvGraphicFramePr>
-          <a:graphic xmlns:a="http://schemas.openxmlformats.org/drawingml/2006/main">
-            <a:graphicData uri="http://schemas.openxmlformats.org/drawingml/2006/picture">
-              <pic:pic xmlns:pic="http://schemas.openxmlformats.org/drawingml/2006/picture">
-                <pic:nvPicPr>
-                  <pic:cNvPr id="1636111817" name="Picture 11" descr="A black and orange logo&#10;&#10;Description automatically generated"/>
-                  <pic:cNvPicPr/>
-                </pic:nvPicPr>
-                <pic:blipFill>
-                  <a:blip r:embed="rId1">
-                    <a:extLst>
-                      <a:ext uri="{28A0092B-C50C-407E-A947-70E740481C1C}">
-                        <a14:useLocalDpi xmlns:a14="http://schemas.microsoft.com/office/drawing/2010/main" val="0"/>
-                      </a:ext>
-                    </a:extLst>
-                  </a:blip>
-                  <a:stretch>
-                    <a:fillRect/>
-                  </a:stretch>
-                </pic:blipFill>
-                <pic:spPr>
-                  <a:xfrm>
-                    <a:off x="0" y="0"/>
-                    <a:ext cx="913130" cy="314325"/>
-                  </a:xfrm>
-                  <a:prstGeom prst="rect">
-                    <a:avLst/>
-                  </a:prstGeom>
-                </pic:spPr>
-              </pic:pic>
-            </a:graphicData>
-          </a:graphic>
-          <wp14:sizeRelH relativeFrom="page">
-            <wp14:pctWidth>0</wp14:pctWidth>
-          </wp14:sizeRelH>
-          <wp14:sizeRelV relativeFrom="page">
-            <wp14:pctHeight>0</wp14:pctHeight>
-          </wp14:sizeRelV>
-        </wp:anchor>
-      </w:drawing>
-    </w:r>
-    <w:r>
-      <w:rPr>
         <w:b/>
         <w:bCs/>
         <w:noProof/>
@@ -12214,8 +12153,8 @@
       <w:drawing>
         <wp:anchor distT="0" distB="0" distL="114300" distR="114300" simplePos="0" relativeHeight="251658240" behindDoc="0" locked="0" layoutInCell="1" allowOverlap="1" wp14:anchorId="17435D23" wp14:editId="1D69CAA4">
           <wp:simplePos x="0" y="0"/>
-          <wp:positionH relativeFrom="column">
-            <wp:posOffset>1664335</wp:posOffset>
+          <wp:positionH relativeFrom="page">
+            <wp:posOffset>3332480</wp:posOffset>
           </wp:positionH>
           <wp:positionV relativeFrom="paragraph">
             <wp:posOffset>374650</wp:posOffset>
@@ -12269,67 +12208,6 @@
     </w:r>
     <w:r>
       <w:rPr>
-        <w:noProof/>
-        <w:color w:val="2D2F67"/>
-      </w:rPr>
-      <w:drawing>
-        <wp:anchor distT="0" distB="0" distL="114300" distR="114300" simplePos="0" relativeHeight="251658241" behindDoc="0" locked="0" layoutInCell="1" allowOverlap="1" wp14:anchorId="54C5A438" wp14:editId="3920DB6B">
-          <wp:simplePos x="0" y="0"/>
-          <wp:positionH relativeFrom="margin">
-            <wp:posOffset>4209415</wp:posOffset>
-          </wp:positionH>
-          <wp:positionV relativeFrom="paragraph">
-            <wp:posOffset>418465</wp:posOffset>
-          </wp:positionV>
-          <wp:extent cx="1226820" cy="323850"/>
-          <wp:effectExtent l="0" t="0" r="0" b="0"/>
-          <wp:wrapSquare wrapText="bothSides"/>
-          <wp:docPr id="1513338301" name="Picture 10" descr="A blue and black logo&#10;&#10;Description automatically generated"/>
-          <wp:cNvGraphicFramePr>
-            <a:graphicFrameLocks xmlns:a="http://schemas.openxmlformats.org/drawingml/2006/main" noChangeAspect="1"/>
-          </wp:cNvGraphicFramePr>
-          <a:graphic xmlns:a="http://schemas.openxmlformats.org/drawingml/2006/main">
-            <a:graphicData uri="http://schemas.openxmlformats.org/drawingml/2006/picture">
-              <pic:pic xmlns:pic="http://schemas.openxmlformats.org/drawingml/2006/picture">
-                <pic:nvPicPr>
-                  <pic:cNvPr id="1678818082" name="Picture 10" descr="A blue and black logo&#10;&#10;Description automatically generated"/>
-                  <pic:cNvPicPr/>
-                </pic:nvPicPr>
-                <pic:blipFill>
-                  <a:blip r:embed="rId3">
-                    <a:extLst>
-                      <a:ext uri="{28A0092B-C50C-407E-A947-70E740481C1C}">
-                        <a14:useLocalDpi xmlns:a14="http://schemas.microsoft.com/office/drawing/2010/main" val="0"/>
-                      </a:ext>
-                    </a:extLst>
-                  </a:blip>
-                  <a:stretch>
-                    <a:fillRect/>
-                  </a:stretch>
-                </pic:blipFill>
-                <pic:spPr>
-                  <a:xfrm>
-                    <a:off x="0" y="0"/>
-                    <a:ext cx="1226820" cy="323850"/>
-                  </a:xfrm>
-                  <a:prstGeom prst="rect">
-                    <a:avLst/>
-                  </a:prstGeom>
-                </pic:spPr>
-              </pic:pic>
-            </a:graphicData>
-          </a:graphic>
-          <wp14:sizeRelH relativeFrom="page">
-            <wp14:pctWidth>0</wp14:pctWidth>
-          </wp14:sizeRelH>
-          <wp14:sizeRelV relativeFrom="page">
-            <wp14:pctHeight>0</wp14:pctHeight>
-          </wp14:sizeRelV>
-        </wp:anchor>
-      </w:drawing>
-    </w:r>
-    <w:r>
-      <w:rPr>
         <w:b/>
         <w:bCs/>
         <w:color w:val="2D2F67"/>
@@ -12455,128 +12333,6 @@
     </w:pPr>
     <w:r>
       <w:rPr>
-        <w:noProof/>
-        <w:color w:val="2D2F67"/>
-      </w:rPr>
-      <w:drawing>
-        <wp:anchor distT="0" distB="0" distL="114300" distR="114300" simplePos="0" relativeHeight="251658246" behindDoc="0" locked="0" layoutInCell="1" allowOverlap="1" wp14:anchorId="24E0B4FF" wp14:editId="73F4D0B9">
-          <wp:simplePos x="0" y="0"/>
-          <wp:positionH relativeFrom="margin">
-            <wp:posOffset>3833495</wp:posOffset>
-          </wp:positionH>
-          <wp:positionV relativeFrom="paragraph">
-            <wp:posOffset>248285</wp:posOffset>
-          </wp:positionV>
-          <wp:extent cx="1226820" cy="323850"/>
-          <wp:effectExtent l="0" t="0" r="0" b="0"/>
-          <wp:wrapSquare wrapText="bothSides"/>
-          <wp:docPr id="1281568942" name="Picture 10" descr="A blue and black logo&#10;&#10;Description automatically generated"/>
-          <wp:cNvGraphicFramePr>
-            <a:graphicFrameLocks xmlns:a="http://schemas.openxmlformats.org/drawingml/2006/main" noChangeAspect="1"/>
-          </wp:cNvGraphicFramePr>
-          <a:graphic xmlns:a="http://schemas.openxmlformats.org/drawingml/2006/main">
-            <a:graphicData uri="http://schemas.openxmlformats.org/drawingml/2006/picture">
-              <pic:pic xmlns:pic="http://schemas.openxmlformats.org/drawingml/2006/picture">
-                <pic:nvPicPr>
-                  <pic:cNvPr id="1678818082" name="Picture 10" descr="A blue and black logo&#10;&#10;Description automatically generated"/>
-                  <pic:cNvPicPr/>
-                </pic:nvPicPr>
-                <pic:blipFill>
-                  <a:blip r:embed="rId1">
-                    <a:extLst>
-                      <a:ext uri="{28A0092B-C50C-407E-A947-70E740481C1C}">
-                        <a14:useLocalDpi xmlns:a14="http://schemas.microsoft.com/office/drawing/2010/main" val="0"/>
-                      </a:ext>
-                    </a:extLst>
-                  </a:blip>
-                  <a:stretch>
-                    <a:fillRect/>
-                  </a:stretch>
-                </pic:blipFill>
-                <pic:spPr>
-                  <a:xfrm>
-                    <a:off x="0" y="0"/>
-                    <a:ext cx="1226820" cy="323850"/>
-                  </a:xfrm>
-                  <a:prstGeom prst="rect">
-                    <a:avLst/>
-                  </a:prstGeom>
-                </pic:spPr>
-              </pic:pic>
-            </a:graphicData>
-          </a:graphic>
-          <wp14:sizeRelH relativeFrom="page">
-            <wp14:pctWidth>0</wp14:pctWidth>
-          </wp14:sizeRelH>
-          <wp14:sizeRelV relativeFrom="page">
-            <wp14:pctHeight>0</wp14:pctHeight>
-          </wp14:sizeRelV>
-        </wp:anchor>
-      </w:drawing>
-    </w:r>
-    <w:r>
-      <w:rPr>
-        <w:noProof/>
-        <w:color w:val="2D2F67"/>
-      </w:rPr>
-      <w:drawing>
-        <wp:anchor distT="0" distB="0" distL="114300" distR="114300" simplePos="0" relativeHeight="251658247" behindDoc="0" locked="0" layoutInCell="1" allowOverlap="1" wp14:anchorId="35B0C5C1" wp14:editId="343DAB36">
-          <wp:simplePos x="0" y="0"/>
-          <wp:positionH relativeFrom="page">
-            <wp:posOffset>3175635</wp:posOffset>
-          </wp:positionH>
-          <wp:positionV relativeFrom="paragraph">
-            <wp:posOffset>240030</wp:posOffset>
-          </wp:positionV>
-          <wp:extent cx="913130" cy="314325"/>
-          <wp:effectExtent l="0" t="0" r="1270" b="9525"/>
-          <wp:wrapSquare wrapText="bothSides"/>
-          <wp:docPr id="1156583183" name="Picture 11" descr="A black and orange logo&#10;&#10;Description automatically generated"/>
-          <wp:cNvGraphicFramePr>
-            <a:graphicFrameLocks xmlns:a="http://schemas.openxmlformats.org/drawingml/2006/main" noChangeAspect="1"/>
-          </wp:cNvGraphicFramePr>
-          <a:graphic xmlns:a="http://schemas.openxmlformats.org/drawingml/2006/main">
-            <a:graphicData uri="http://schemas.openxmlformats.org/drawingml/2006/picture">
-              <pic:pic xmlns:pic="http://schemas.openxmlformats.org/drawingml/2006/picture">
-                <pic:nvPicPr>
-                  <pic:cNvPr id="1636111817" name="Picture 11" descr="A black and orange logo&#10;&#10;Description automatically generated"/>
-                  <pic:cNvPicPr/>
-                </pic:nvPicPr>
-                <pic:blipFill>
-                  <a:blip r:embed="rId2">
-                    <a:extLst>
-                      <a:ext uri="{28A0092B-C50C-407E-A947-70E740481C1C}">
-                        <a14:useLocalDpi xmlns:a14="http://schemas.microsoft.com/office/drawing/2010/main" val="0"/>
-                      </a:ext>
-                    </a:extLst>
-                  </a:blip>
-                  <a:stretch>
-                    <a:fillRect/>
-                  </a:stretch>
-                </pic:blipFill>
-                <pic:spPr>
-                  <a:xfrm>
-                    <a:off x="0" y="0"/>
-                    <a:ext cx="913130" cy="314325"/>
-                  </a:xfrm>
-                  <a:prstGeom prst="rect">
-                    <a:avLst/>
-                  </a:prstGeom>
-                </pic:spPr>
-              </pic:pic>
-            </a:graphicData>
-          </a:graphic>
-          <wp14:sizeRelH relativeFrom="page">
-            <wp14:pctWidth>0</wp14:pctWidth>
-          </wp14:sizeRelH>
-          <wp14:sizeRelV relativeFrom="page">
-            <wp14:pctHeight>0</wp14:pctHeight>
-          </wp14:sizeRelV>
-        </wp:anchor>
-      </w:drawing>
-    </w:r>
-    <w:r>
-      <w:rPr>
         <w:b/>
         <w:bCs/>
         <w:noProof/>
@@ -12585,8 +12341,8 @@
       <w:drawing>
         <wp:anchor distT="0" distB="0" distL="114300" distR="114300" simplePos="0" relativeHeight="251658245" behindDoc="0" locked="0" layoutInCell="1" allowOverlap="1" wp14:anchorId="6C1B9A32" wp14:editId="31C6853C">
           <wp:simplePos x="0" y="0"/>
-          <wp:positionH relativeFrom="column">
-            <wp:posOffset>1621790</wp:posOffset>
+          <wp:positionH relativeFrom="page">
+            <wp:posOffset>3332480</wp:posOffset>
           </wp:positionH>
           <wp:positionV relativeFrom="paragraph">
             <wp:posOffset>207645</wp:posOffset>

</xml_diff>